<commit_message>
update vector store with updated info
</commit_message>
<xml_diff>
--- a/assets/_Ashekur Rahman - Professional Profile.docx
+++ b/assets/_Ashekur Rahman - Professional Profile.docx
@@ -64,6 +64,17 @@
         <w:rPr>
           <w:rtl w:val="0"/>
         </w:rPr>
+        <w:t xml:space="preserve">**Phone:** +8801795665287</w:t>
+      </w:r>
+    </w:p>
+    <w:p>
+      <w:pPr>
+        <w:rPr/>
+      </w:pPr>
+      <w:r>
+        <w:rPr>
+          <w:rtl w:val="0"/>
+        </w:rPr>
         <w:t xml:space="preserve">**Current Role:** Software Developer</w:t>
       </w:r>
     </w:p>
@@ -431,7 +442,7 @@
         <w:rPr>
           <w:rtl w:val="0"/>
         </w:rPr>
-        <w:t xml:space="preserve">**Lead Front-end Developer at Goama (08/2023 - 12/2024)**</w:t>
+        <w:t xml:space="preserve">**Lead Front-end Developer at Goama (08/2023 - Present)**</w:t>
       </w:r>
     </w:p>
     <w:p>
@@ -908,62 +919,62 @@
         <w:rPr>
           <w:rtl w:val="0"/>
         </w:rPr>
-        <w:t xml:space="preserve">- React.js (5+ years) ❤️</w:t>
-      </w:r>
-    </w:p>
-    <w:p>
-      <w:pPr>
-        <w:rPr/>
-      </w:pPr>
-      <w:r>
-        <w:rPr>
-          <w:rtl w:val="0"/>
-        </w:rPr>
-        <w:t xml:space="preserve">- TypeScript (4+ years) 🔥</w:t>
-      </w:r>
-    </w:p>
-    <w:p>
-      <w:pPr>
-        <w:rPr/>
-      </w:pPr>
-      <w:r>
-        <w:rPr>
-          <w:rtl w:val="0"/>
-        </w:rPr>
-        <w:t xml:space="preserve">- Node.js (6+ years) ⚡</w:t>
-      </w:r>
-    </w:p>
-    <w:p>
-      <w:pPr>
-        <w:rPr/>
-      </w:pPr>
-      <w:r>
-        <w:rPr>
-          <w:rtl w:val="0"/>
-        </w:rPr>
-        <w:t xml:space="preserve">- Python (3+ years) 🐍</w:t>
-      </w:r>
-    </w:p>
-    <w:p>
-      <w:pPr>
-        <w:rPr/>
-      </w:pPr>
-      <w:r>
-        <w:rPr>
-          <w:rtl w:val="0"/>
-        </w:rPr>
-        <w:t xml:space="preserve">- AI/ML (2+ years) 🤖</w:t>
-      </w:r>
-    </w:p>
-    <w:p>
-      <w:pPr>
-        <w:rPr/>
-      </w:pPr>
-      <w:r>
-        <w:rPr>
-          <w:rtl w:val="0"/>
-        </w:rPr>
-        <w:t xml:space="preserve">- Cloud Technologies (4+ years) ☁️</w:t>
+        <w:t xml:space="preserve">- React.js (6+ years) ❤️</w:t>
+      </w:r>
+    </w:p>
+    <w:p>
+      <w:pPr>
+        <w:rPr/>
+      </w:pPr>
+      <w:r>
+        <w:rPr>
+          <w:rtl w:val="0"/>
+        </w:rPr>
+        <w:t xml:space="preserve">- TypeScript (7+ years) 🔥</w:t>
+      </w:r>
+    </w:p>
+    <w:p>
+      <w:pPr>
+        <w:rPr/>
+      </w:pPr>
+      <w:r>
+        <w:rPr>
+          <w:rtl w:val="0"/>
+        </w:rPr>
+        <w:t xml:space="preserve">- Node.js (5+ years) ⚡</w:t>
+      </w:r>
+    </w:p>
+    <w:p>
+      <w:pPr>
+        <w:rPr/>
+      </w:pPr>
+      <w:r>
+        <w:rPr>
+          <w:rtl w:val="0"/>
+        </w:rPr>
+        <w:t xml:space="preserve">- Python (1+ years) 🐍</w:t>
+      </w:r>
+    </w:p>
+    <w:p>
+      <w:pPr>
+        <w:rPr/>
+      </w:pPr>
+      <w:r>
+        <w:rPr>
+          <w:rtl w:val="0"/>
+        </w:rPr>
+        <w:t xml:space="preserve">- AI/LLM (1+ years) 🤖</w:t>
+      </w:r>
+    </w:p>
+    <w:p>
+      <w:pPr>
+        <w:rPr/>
+      </w:pPr>
+      <w:r>
+        <w:rPr>
+          <w:rtl w:val="0"/>
+        </w:rPr>
+        <w:t xml:space="preserve">- Cloud Technologies (1+ years) ☁️</w:t>
       </w:r>
     </w:p>
     <w:p>
@@ -1429,6 +1440,71 @@
           <w:rtl w:val="0"/>
         </w:rPr>
         <w:t xml:space="preserve">- Tech: React.js, Next.js, Node.js, Python</w:t>
+      </w:r>
+    </w:p>
+    <w:p>
+      <w:pPr>
+        <w:rPr/>
+      </w:pPr>
+      <w:r>
+        <w:rPr>
+          <w:rtl w:val="0"/>
+        </w:rPr>
+      </w:r>
+    </w:p>
+    <w:p>
+      <w:pPr>
+        <w:rPr/>
+      </w:pPr>
+      <w:r>
+        <w:rPr>
+          <w:rtl w:val="0"/>
+        </w:rPr>
+        <w:t xml:space="preserve">**Botberry Platform**</w:t>
+      </w:r>
+    </w:p>
+    <w:p>
+      <w:pPr>
+        <w:rPr/>
+      </w:pPr>
+      <w:r>
+        <w:rPr>
+          <w:rtl w:val="0"/>
+        </w:rPr>
+        <w:t xml:space="preserve">- Bot platform featuring gamification, blockchain, monetization</w:t>
+      </w:r>
+    </w:p>
+    <w:p>
+      <w:pPr>
+        <w:rPr/>
+      </w:pPr>
+      <w:r>
+        <w:rPr>
+          <w:rtl w:val="0"/>
+        </w:rPr>
+        <w:t xml:space="preserve">- Integrates with Telegram and custom apps</w:t>
+      </w:r>
+    </w:p>
+    <w:p>
+      <w:pPr>
+        <w:rPr/>
+      </w:pPr>
+      <w:r>
+        <w:rPr>
+          <w:rtl w:val="0"/>
+        </w:rPr>
+        <w:t xml:space="preserve">- Live demo: https://botberry.io</w:t>
+      </w:r>
+    </w:p>
+    <w:p>
+      <w:pPr>
+        <w:rPr/>
+      </w:pPr>
+      <w:r>
+        <w:rPr>
+          <w:rtl w:val="0"/>
+        </w:rPr>
+        <w:t xml:space="preserve">- Tech: React.js, Next.js, Tailwind, Shadcn</w:t>
       </w:r>
     </w:p>
     <w:p>

</xml_diff>